<commit_message>
adding new lab reports
</commit_message>
<xml_diff>
--- a/CN/lab8.docx
+++ b/CN/lab8.docx
@@ -2642,8 +2642,585 @@
           <w:rFonts w:ascii="Times New Roman" w:hAnsi="Times New Roman" w:cs="Times New Roman"/>
           <w:sz w:val="22"/>
           <w:szCs w:val="22"/>
+          <w:highlight w:val="yellow"/>
         </w:rPr>
       </w:pPr>
+      <w:r>
+        <w:rPr>
+          <w:rFonts w:ascii="Times New Roman" w:hAnsi="Times New Roman" w:cs="Times New Roman"/>
+          <w:sz w:val="22"/>
+          <w:szCs w:val="22"/>
+          <w:highlight w:val="yellow"/>
+        </w:rPr>
+        <w:t>Router&gt;enable</w:t>
+      </w:r>
+    </w:p>
+    <w:p>
+      <w:pPr>
+        <w:rPr>
+          <w:rFonts w:ascii="Times New Roman" w:hAnsi="Times New Roman" w:cs="Times New Roman"/>
+          <w:sz w:val="22"/>
+          <w:szCs w:val="22"/>
+          <w:highlight w:val="yellow"/>
+        </w:rPr>
+      </w:pPr>
+      <w:r>
+        <w:rPr>
+          <w:rFonts w:ascii="Times New Roman" w:hAnsi="Times New Roman" w:cs="Times New Roman"/>
+          <w:sz w:val="22"/>
+          <w:szCs w:val="22"/>
+          <w:highlight w:val="yellow"/>
+        </w:rPr>
+        <w:t>Router#configure terminal</w:t>
+      </w:r>
+    </w:p>
+    <w:p>
+      <w:pPr>
+        <w:rPr>
+          <w:rFonts w:ascii="Times New Roman" w:hAnsi="Times New Roman" w:cs="Times New Roman"/>
+          <w:sz w:val="22"/>
+          <w:szCs w:val="22"/>
+          <w:highlight w:val="yellow"/>
+        </w:rPr>
+      </w:pPr>
+    </w:p>
+    <w:p>
+      <w:pPr>
+        <w:rPr>
+          <w:rFonts w:ascii="Times New Roman" w:hAnsi="Times New Roman" w:cs="Times New Roman"/>
+          <w:sz w:val="22"/>
+          <w:szCs w:val="22"/>
+          <w:highlight w:val="yellow"/>
+        </w:rPr>
+      </w:pPr>
+      <w:r>
+        <w:rPr>
+          <w:rFonts w:ascii="Times New Roman" w:hAnsi="Times New Roman" w:cs="Times New Roman"/>
+          <w:sz w:val="22"/>
+          <w:szCs w:val="22"/>
+          <w:highlight w:val="yellow"/>
+        </w:rPr>
+        <w:t>! -----------------------------</w:t>
+      </w:r>
+    </w:p>
+    <w:p>
+      <w:pPr>
+        <w:rPr>
+          <w:rFonts w:ascii="Times New Roman" w:hAnsi="Times New Roman" w:cs="Times New Roman"/>
+          <w:sz w:val="22"/>
+          <w:szCs w:val="22"/>
+          <w:highlight w:val="yellow"/>
+        </w:rPr>
+      </w:pPr>
+      <w:r>
+        <w:rPr>
+          <w:rFonts w:ascii="Times New Roman" w:hAnsi="Times New Roman" w:cs="Times New Roman"/>
+          <w:sz w:val="22"/>
+          <w:szCs w:val="22"/>
+          <w:highlight w:val="yellow"/>
+        </w:rPr>
+        <w:t>! Bus Network Interface</w:t>
+      </w:r>
+    </w:p>
+    <w:p>
+      <w:pPr>
+        <w:rPr>
+          <w:rFonts w:ascii="Times New Roman" w:hAnsi="Times New Roman" w:cs="Times New Roman"/>
+          <w:sz w:val="22"/>
+          <w:szCs w:val="22"/>
+          <w:highlight w:val="yellow"/>
+        </w:rPr>
+      </w:pPr>
+      <w:r>
+        <w:rPr>
+          <w:rFonts w:ascii="Times New Roman" w:hAnsi="Times New Roman" w:cs="Times New Roman"/>
+          <w:sz w:val="22"/>
+          <w:szCs w:val="22"/>
+          <w:highlight w:val="yellow"/>
+        </w:rPr>
+        <w:t>! -----------------------------</w:t>
+      </w:r>
+    </w:p>
+    <w:p>
+      <w:pPr>
+        <w:rPr>
+          <w:rFonts w:ascii="Times New Roman" w:hAnsi="Times New Roman" w:cs="Times New Roman"/>
+          <w:sz w:val="22"/>
+          <w:szCs w:val="22"/>
+          <w:highlight w:val="yellow"/>
+        </w:rPr>
+      </w:pPr>
+      <w:r>
+        <w:rPr>
+          <w:rFonts w:ascii="Times New Roman" w:hAnsi="Times New Roman" w:cs="Times New Roman"/>
+          <w:sz w:val="22"/>
+          <w:szCs w:val="22"/>
+          <w:highlight w:val="yellow"/>
+        </w:rPr>
+        <w:t>Router(config)#interface gigabitEthernet 0/0</w:t>
+      </w:r>
+    </w:p>
+    <w:p>
+      <w:pPr>
+        <w:rPr>
+          <w:rFonts w:ascii="Times New Roman" w:hAnsi="Times New Roman" w:cs="Times New Roman"/>
+          <w:sz w:val="22"/>
+          <w:szCs w:val="22"/>
+          <w:highlight w:val="yellow"/>
+        </w:rPr>
+      </w:pPr>
+      <w:r>
+        <w:rPr>
+          <w:rFonts w:ascii="Times New Roman" w:hAnsi="Times New Roman" w:cs="Times New Roman"/>
+          <w:sz w:val="22"/>
+          <w:szCs w:val="22"/>
+          <w:highlight w:val="yellow"/>
+        </w:rPr>
+        <w:t>Router(config-if)#ip address 192.127.10.1</w:t>
+      </w:r>
+      <w:r>
+        <w:rPr>
+          <w:rFonts w:ascii="Times New Roman" w:hAnsi="Times New Roman" w:cs="Times New Roman"/>
+          <w:sz w:val="22"/>
+          <w:szCs w:val="22"/>
+          <w:highlight w:val="yellow"/>
+        </w:rPr>
+        <w:t xml:space="preserve"> </w:t>
+      </w:r>
+      <w:r>
+        <w:rPr>
+          <w:rFonts w:ascii="Times New Roman" w:hAnsi="Times New Roman" w:cs="Times New Roman"/>
+          <w:sz w:val="22"/>
+          <w:szCs w:val="22"/>
+          <w:highlight w:val="yellow"/>
+        </w:rPr>
+        <w:t>255.255.255.0</w:t>
+      </w:r>
+    </w:p>
+    <w:p>
+      <w:pPr>
+        <w:rPr>
+          <w:rFonts w:ascii="Times New Roman" w:hAnsi="Times New Roman" w:cs="Times New Roman"/>
+          <w:sz w:val="22"/>
+          <w:szCs w:val="22"/>
+          <w:highlight w:val="yellow"/>
+        </w:rPr>
+      </w:pPr>
+      <w:r>
+        <w:rPr>
+          <w:rFonts w:ascii="Times New Roman" w:hAnsi="Times New Roman" w:cs="Times New Roman"/>
+          <w:sz w:val="22"/>
+          <w:szCs w:val="22"/>
+          <w:highlight w:val="yellow"/>
+        </w:rPr>
+        <w:t>Router(config-if)#no shutdown</w:t>
+      </w:r>
+    </w:p>
+    <w:p>
+      <w:pPr>
+        <w:rPr>
+          <w:rFonts w:ascii="Times New Roman" w:hAnsi="Times New Roman" w:cs="Times New Roman"/>
+          <w:sz w:val="22"/>
+          <w:szCs w:val="22"/>
+          <w:highlight w:val="yellow"/>
+        </w:rPr>
+      </w:pPr>
+      <w:r>
+        <w:rPr>
+          <w:rFonts w:ascii="Times New Roman" w:hAnsi="Times New Roman" w:cs="Times New Roman"/>
+          <w:sz w:val="22"/>
+          <w:szCs w:val="22"/>
+          <w:highlight w:val="yellow"/>
+        </w:rPr>
+        <w:t>Router(config-if)#exit</w:t>
+      </w:r>
+    </w:p>
+    <w:p>
+      <w:pPr>
+        <w:rPr>
+          <w:rFonts w:ascii="Times New Roman" w:hAnsi="Times New Roman" w:cs="Times New Roman"/>
+          <w:sz w:val="22"/>
+          <w:szCs w:val="22"/>
+          <w:highlight w:val="yellow"/>
+        </w:rPr>
+      </w:pPr>
+    </w:p>
+    <w:p>
+      <w:pPr>
+        <w:rPr>
+          <w:rFonts w:ascii="Times New Roman" w:hAnsi="Times New Roman" w:cs="Times New Roman"/>
+          <w:sz w:val="22"/>
+          <w:szCs w:val="22"/>
+          <w:highlight w:val="yellow"/>
+        </w:rPr>
+      </w:pPr>
+      <w:r>
+        <w:rPr>
+          <w:rFonts w:ascii="Times New Roman" w:hAnsi="Times New Roman" w:cs="Times New Roman"/>
+          <w:sz w:val="22"/>
+          <w:szCs w:val="22"/>
+          <w:highlight w:val="yellow"/>
+        </w:rPr>
+        <w:lastRenderedPageBreak/>
+        <w:t>! -----------------------------</w:t>
+      </w:r>
+    </w:p>
+    <w:p>
+      <w:pPr>
+        <w:rPr>
+          <w:rFonts w:ascii="Times New Roman" w:hAnsi="Times New Roman" w:cs="Times New Roman"/>
+          <w:sz w:val="22"/>
+          <w:szCs w:val="22"/>
+          <w:highlight w:val="yellow"/>
+        </w:rPr>
+      </w:pPr>
+      <w:r>
+        <w:rPr>
+          <w:rFonts w:ascii="Times New Roman" w:hAnsi="Times New Roman" w:cs="Times New Roman"/>
+          <w:sz w:val="22"/>
+          <w:szCs w:val="22"/>
+          <w:highlight w:val="yellow"/>
+        </w:rPr>
+        <w:t>! Ring Network Interface</w:t>
+      </w:r>
+    </w:p>
+    <w:p>
+      <w:pPr>
+        <w:rPr>
+          <w:rFonts w:ascii="Times New Roman" w:hAnsi="Times New Roman" w:cs="Times New Roman"/>
+          <w:sz w:val="22"/>
+          <w:szCs w:val="22"/>
+          <w:highlight w:val="yellow"/>
+        </w:rPr>
+      </w:pPr>
+      <w:r>
+        <w:rPr>
+          <w:rFonts w:ascii="Times New Roman" w:hAnsi="Times New Roman" w:cs="Times New Roman"/>
+          <w:sz w:val="22"/>
+          <w:szCs w:val="22"/>
+          <w:highlight w:val="yellow"/>
+        </w:rPr>
+        <w:t>! -----------------------------</w:t>
+      </w:r>
+    </w:p>
+    <w:p>
+      <w:pPr>
+        <w:rPr>
+          <w:rFonts w:ascii="Times New Roman" w:hAnsi="Times New Roman" w:cs="Times New Roman"/>
+          <w:sz w:val="22"/>
+          <w:szCs w:val="22"/>
+          <w:highlight w:val="yellow"/>
+        </w:rPr>
+      </w:pPr>
+      <w:r>
+        <w:rPr>
+          <w:rFonts w:ascii="Times New Roman" w:hAnsi="Times New Roman" w:cs="Times New Roman"/>
+          <w:sz w:val="22"/>
+          <w:szCs w:val="22"/>
+          <w:highlight w:val="yellow"/>
+        </w:rPr>
+        <w:t>Router(config)#interface gigabitEthernet 0/1</w:t>
+      </w:r>
+    </w:p>
+    <w:p>
+      <w:pPr>
+        <w:rPr>
+          <w:rFonts w:ascii="Times New Roman" w:hAnsi="Times New Roman" w:cs="Times New Roman"/>
+          <w:sz w:val="22"/>
+          <w:szCs w:val="22"/>
+          <w:highlight w:val="yellow"/>
+        </w:rPr>
+      </w:pPr>
+      <w:r>
+        <w:rPr>
+          <w:rFonts w:ascii="Times New Roman" w:hAnsi="Times New Roman" w:cs="Times New Roman"/>
+          <w:sz w:val="22"/>
+          <w:szCs w:val="22"/>
+          <w:highlight w:val="yellow"/>
+        </w:rPr>
+        <w:t>Router(config-if)#ip address 192.127</w:t>
+      </w:r>
+      <w:r>
+        <w:rPr>
+          <w:rFonts w:ascii="Times New Roman" w:hAnsi="Times New Roman" w:cs="Times New Roman"/>
+          <w:sz w:val="22"/>
+          <w:szCs w:val="22"/>
+          <w:highlight w:val="yellow"/>
+        </w:rPr>
+        <w:t>.2</w:t>
+      </w:r>
+      <w:r>
+        <w:rPr>
+          <w:rFonts w:ascii="Times New Roman" w:hAnsi="Times New Roman" w:cs="Times New Roman"/>
+          <w:sz w:val="22"/>
+          <w:szCs w:val="22"/>
+          <w:highlight w:val="yellow"/>
+        </w:rPr>
+        <w:t>0.1</w:t>
+      </w:r>
+      <w:r>
+        <w:rPr>
+          <w:rFonts w:ascii="Times New Roman" w:hAnsi="Times New Roman" w:cs="Times New Roman"/>
+          <w:sz w:val="22"/>
+          <w:szCs w:val="22"/>
+          <w:highlight w:val="yellow"/>
+        </w:rPr>
+        <w:t xml:space="preserve"> </w:t>
+      </w:r>
+      <w:r>
+        <w:rPr>
+          <w:rFonts w:ascii="Times New Roman" w:hAnsi="Times New Roman" w:cs="Times New Roman"/>
+          <w:sz w:val="22"/>
+          <w:szCs w:val="22"/>
+          <w:highlight w:val="yellow"/>
+        </w:rPr>
+        <w:t>255.255.255.0</w:t>
+      </w:r>
+    </w:p>
+    <w:p>
+      <w:pPr>
+        <w:rPr>
+          <w:rFonts w:ascii="Times New Roman" w:hAnsi="Times New Roman" w:cs="Times New Roman"/>
+          <w:sz w:val="22"/>
+          <w:szCs w:val="22"/>
+          <w:highlight w:val="yellow"/>
+        </w:rPr>
+      </w:pPr>
+      <w:r>
+        <w:rPr>
+          <w:rFonts w:ascii="Times New Roman" w:hAnsi="Times New Roman" w:cs="Times New Roman"/>
+          <w:sz w:val="22"/>
+          <w:szCs w:val="22"/>
+          <w:highlight w:val="yellow"/>
+        </w:rPr>
+        <w:t>Router(config-if)#no shutdown</w:t>
+      </w:r>
+    </w:p>
+    <w:p>
+      <w:pPr>
+        <w:rPr>
+          <w:rFonts w:ascii="Times New Roman" w:hAnsi="Times New Roman" w:cs="Times New Roman"/>
+          <w:sz w:val="22"/>
+          <w:szCs w:val="22"/>
+          <w:highlight w:val="yellow"/>
+        </w:rPr>
+      </w:pPr>
+      <w:r>
+        <w:rPr>
+          <w:rFonts w:ascii="Times New Roman" w:hAnsi="Times New Roman" w:cs="Times New Roman"/>
+          <w:sz w:val="22"/>
+          <w:szCs w:val="22"/>
+          <w:highlight w:val="yellow"/>
+        </w:rPr>
+        <w:t>Router(config-if)#exit</w:t>
+      </w:r>
+    </w:p>
+    <w:p>
+      <w:pPr>
+        <w:rPr>
+          <w:rFonts w:ascii="Times New Roman" w:hAnsi="Times New Roman" w:cs="Times New Roman"/>
+          <w:sz w:val="22"/>
+          <w:szCs w:val="22"/>
+          <w:highlight w:val="yellow"/>
+        </w:rPr>
+      </w:pPr>
+    </w:p>
+    <w:p>
+      <w:pPr>
+        <w:rPr>
+          <w:rFonts w:ascii="Times New Roman" w:hAnsi="Times New Roman" w:cs="Times New Roman"/>
+          <w:sz w:val="22"/>
+          <w:szCs w:val="22"/>
+          <w:highlight w:val="yellow"/>
+        </w:rPr>
+      </w:pPr>
+      <w:r>
+        <w:rPr>
+          <w:rFonts w:ascii="Times New Roman" w:hAnsi="Times New Roman" w:cs="Times New Roman"/>
+          <w:sz w:val="22"/>
+          <w:szCs w:val="22"/>
+          <w:highlight w:val="yellow"/>
+        </w:rPr>
+        <w:t>! -----------------------------</w:t>
+      </w:r>
+    </w:p>
+    <w:p>
+      <w:pPr>
+        <w:rPr>
+          <w:rFonts w:ascii="Times New Roman" w:hAnsi="Times New Roman" w:cs="Times New Roman"/>
+          <w:sz w:val="22"/>
+          <w:szCs w:val="22"/>
+          <w:highlight w:val="yellow"/>
+        </w:rPr>
+      </w:pPr>
+      <w:r>
+        <w:rPr>
+          <w:rFonts w:ascii="Times New Roman" w:hAnsi="Times New Roman" w:cs="Times New Roman"/>
+          <w:sz w:val="22"/>
+          <w:szCs w:val="22"/>
+          <w:highlight w:val="yellow"/>
+        </w:rPr>
+        <w:t>! Star Network Interface</w:t>
+      </w:r>
+    </w:p>
+    <w:p>
+      <w:pPr>
+        <w:rPr>
+          <w:rFonts w:ascii="Times New Roman" w:hAnsi="Times New Roman" w:cs="Times New Roman"/>
+          <w:sz w:val="22"/>
+          <w:szCs w:val="22"/>
+          <w:highlight w:val="yellow"/>
+        </w:rPr>
+      </w:pPr>
+      <w:r>
+        <w:rPr>
+          <w:rFonts w:ascii="Times New Roman" w:hAnsi="Times New Roman" w:cs="Times New Roman"/>
+          <w:sz w:val="22"/>
+          <w:szCs w:val="22"/>
+          <w:highlight w:val="yellow"/>
+        </w:rPr>
+        <w:t>! -----------------------------</w:t>
+      </w:r>
+    </w:p>
+    <w:p>
+      <w:pPr>
+        <w:rPr>
+          <w:rFonts w:ascii="Times New Roman" w:hAnsi="Times New Roman" w:cs="Times New Roman"/>
+          <w:sz w:val="22"/>
+          <w:szCs w:val="22"/>
+          <w:highlight w:val="yellow"/>
+        </w:rPr>
+      </w:pPr>
+      <w:r>
+        <w:rPr>
+          <w:rFonts w:ascii="Times New Roman" w:hAnsi="Times New Roman" w:cs="Times New Roman"/>
+          <w:sz w:val="22"/>
+          <w:szCs w:val="22"/>
+          <w:highlight w:val="yellow"/>
+        </w:rPr>
+        <w:t>Router(config)#interface gigabitEthernet 0/2</w:t>
+      </w:r>
+    </w:p>
+    <w:p>
+      <w:pPr>
+        <w:rPr>
+          <w:rFonts w:ascii="Times New Roman" w:hAnsi="Times New Roman" w:cs="Times New Roman"/>
+          <w:sz w:val="22"/>
+          <w:szCs w:val="22"/>
+          <w:highlight w:val="yellow"/>
+        </w:rPr>
+      </w:pPr>
+      <w:r>
+        <w:rPr>
+          <w:rFonts w:ascii="Times New Roman" w:hAnsi="Times New Roman" w:cs="Times New Roman"/>
+          <w:sz w:val="22"/>
+          <w:szCs w:val="22"/>
+          <w:highlight w:val="yellow"/>
+        </w:rPr>
+        <w:t>Router(config-if)#ip address 192.127.</w:t>
+      </w:r>
+      <w:r>
+        <w:rPr>
+          <w:rFonts w:ascii="Times New Roman" w:hAnsi="Times New Roman" w:cs="Times New Roman"/>
+          <w:sz w:val="22"/>
+          <w:szCs w:val="22"/>
+          <w:highlight w:val="yellow"/>
+        </w:rPr>
+        <w:t>3</w:t>
+      </w:r>
+      <w:r>
+        <w:rPr>
+          <w:rFonts w:ascii="Times New Roman" w:hAnsi="Times New Roman" w:cs="Times New Roman"/>
+          <w:sz w:val="22"/>
+          <w:szCs w:val="22"/>
+          <w:highlight w:val="yellow"/>
+        </w:rPr>
+        <w:t>0.1</w:t>
+      </w:r>
+      <w:r>
+        <w:rPr>
+          <w:rFonts w:ascii="Times New Roman" w:hAnsi="Times New Roman" w:cs="Times New Roman"/>
+          <w:sz w:val="22"/>
+          <w:szCs w:val="22"/>
+          <w:highlight w:val="yellow"/>
+        </w:rPr>
+        <w:t xml:space="preserve"> </w:t>
+      </w:r>
+      <w:r>
+        <w:rPr>
+          <w:rFonts w:ascii="Times New Roman" w:hAnsi="Times New Roman" w:cs="Times New Roman"/>
+          <w:sz w:val="22"/>
+          <w:szCs w:val="22"/>
+          <w:highlight w:val="yellow"/>
+        </w:rPr>
+        <w:t>255.255.255.0</w:t>
+      </w:r>
+    </w:p>
+    <w:p>
+      <w:pPr>
+        <w:rPr>
+          <w:rFonts w:ascii="Times New Roman" w:hAnsi="Times New Roman" w:cs="Times New Roman"/>
+          <w:sz w:val="22"/>
+          <w:szCs w:val="22"/>
+          <w:highlight w:val="yellow"/>
+        </w:rPr>
+      </w:pPr>
+      <w:r>
+        <w:rPr>
+          <w:rFonts w:ascii="Times New Roman" w:hAnsi="Times New Roman" w:cs="Times New Roman"/>
+          <w:sz w:val="22"/>
+          <w:szCs w:val="22"/>
+          <w:highlight w:val="yellow"/>
+        </w:rPr>
+        <w:t>Router(config-if)#no shutdown</w:t>
+      </w:r>
+    </w:p>
+    <w:p>
+      <w:pPr>
+        <w:rPr>
+          <w:rFonts w:ascii="Times New Roman" w:hAnsi="Times New Roman" w:cs="Times New Roman"/>
+          <w:sz w:val="22"/>
+          <w:szCs w:val="22"/>
+          <w:highlight w:val="yellow"/>
+        </w:rPr>
+      </w:pPr>
+      <w:r>
+        <w:rPr>
+          <w:rFonts w:ascii="Times New Roman" w:hAnsi="Times New Roman" w:cs="Times New Roman"/>
+          <w:sz w:val="22"/>
+          <w:szCs w:val="22"/>
+          <w:highlight w:val="yellow"/>
+        </w:rPr>
+        <w:t>Router(config-if)#exit</w:t>
+      </w:r>
+    </w:p>
+    <w:p>
+      <w:pPr>
+        <w:rPr>
+          <w:rFonts w:ascii="Times New Roman" w:hAnsi="Times New Roman" w:cs="Times New Roman"/>
+          <w:sz w:val="22"/>
+          <w:szCs w:val="22"/>
+          <w:highlight w:val="yellow"/>
+        </w:rPr>
+      </w:pPr>
+    </w:p>
+    <w:p>
+      <w:pPr>
+        <w:rPr>
+          <w:rFonts w:ascii="Times New Roman" w:hAnsi="Times New Roman" w:cs="Times New Roman"/>
+          <w:sz w:val="22"/>
+          <w:szCs w:val="22"/>
+        </w:rPr>
+      </w:pPr>
+      <w:r>
+        <w:rPr>
+          <w:rFonts w:ascii="Times New Roman" w:hAnsi="Times New Roman" w:cs="Times New Roman"/>
+          <w:sz w:val="22"/>
+          <w:szCs w:val="22"/>
+          <w:highlight w:val="yellow"/>
+        </w:rPr>
+        <w:t>Router(config)#exit</w:t>
+      </w:r>
     </w:p>
     <w:p>
       <w:pPr>
@@ -2761,7 +3338,6 @@
           <w:sz w:val="22"/>
           <w:szCs w:val="22"/>
         </w:rPr>
-        <w:lastRenderedPageBreak/>
         <w:t>From PC</w:t>
       </w:r>
       <w:r>
@@ -2796,6 +3372,7 @@
           <w:sz w:val="22"/>
           <w:szCs w:val="22"/>
         </w:rPr>
+        <w:lastRenderedPageBreak/>
         <w:drawing>
           <wp:inline distT="0" distB="0" distL="0" distR="0" wp14:anchorId="0624D868" wp14:editId="2F777342">
             <wp:extent cx="5502910" cy="5021580"/>
@@ -2906,7 +3483,6 @@
           <w:sz w:val="22"/>
           <w:szCs w:val="22"/>
         </w:rPr>
-        <w:lastRenderedPageBreak/>
         <w:drawing>
           <wp:inline distT="0" distB="0" distL="0" distR="0" wp14:anchorId="088CBBA6" wp14:editId="3250310D">
             <wp:extent cx="5502910" cy="2811780"/>
@@ -2982,6 +3558,7 @@
           <w:sz w:val="22"/>
           <w:szCs w:val="22"/>
         </w:rPr>
+        <w:lastRenderedPageBreak/>
         <w:t>From PC8 (Star) → PC1 (Bus):</w:t>
       </w:r>
     </w:p>
@@ -3218,7 +3795,6 @@
           <w:sz w:val="22"/>
           <w:szCs w:val="22"/>
         </w:rPr>
-        <w:lastRenderedPageBreak/>
         <w:t>Conclusion</w:t>
       </w:r>
     </w:p>
@@ -23393,6 +23969,7 @@
   <w:style w:type="character" w:default="1" w:styleId="DefaultParagraphFont">
     <w:name w:val="Default Paragraph Font"/>
     <w:uiPriority w:val="1"/>
+    <w:semiHidden/>
     <w:unhideWhenUsed/>
   </w:style>
   <w:style w:type="table" w:default="1" w:styleId="TableNormal">

</xml_diff>